<commit_message>
feat: Add missing subjects and ReadMe files
</commit_message>
<xml_diff>
--- a/08-semester/Прочностной анализ/Вопросы к экзамену/Voprosy_k_ekzamenu_06_2025.docx
+++ b/08-semester/Прочностной анализ/Вопросы к экзамену/Voprosy_k_ekzamenu_06_2025.docx
@@ -1,6 +1,6 @@
 
 <file path=word/document.xml><?xml version="1.0" encoding="utf-8"?>
-<w:document xmlns:wpc="http://schemas.microsoft.com/office/word/2010/wordprocessingCanvas" xmlns:mc="http://schemas.openxmlformats.org/markup-compatibility/2006" xmlns:o="urn:schemas-microsoft-com:office:office" xmlns:r="http://schemas.openxmlformats.org/officeDocument/2006/relationships" xmlns:m="http://schemas.openxmlformats.org/officeDocument/2006/math" xmlns:v="urn:schemas-microsoft-com:vml" xmlns:wp14="http://schemas.microsoft.com/office/word/2010/wordprocessingDrawing" xmlns:wp="http://schemas.openxmlformats.org/drawingml/2006/wordprocessingDrawing" xmlns:w10="urn:schemas-microsoft-com:office:word" xmlns:w="http://schemas.openxmlformats.org/wordprocessingml/2006/main" xmlns:w14="http://schemas.microsoft.com/office/word/2010/wordml" xmlns:w15="http://schemas.microsoft.com/office/word/2012/wordml" xmlns:wpg="http://schemas.microsoft.com/office/word/2010/wordprocessingGroup" xmlns:wpi="http://schemas.microsoft.com/office/word/2010/wordprocessingInk" xmlns:wne="http://schemas.microsoft.com/office/word/2006/wordml" xmlns:wps="http://schemas.microsoft.com/office/word/2010/wordprocessingShape" mc:Ignorable="w14 w15 wp14">
+<w:document xmlns:wpc="http://schemas.microsoft.com/office/word/2010/wordprocessingCanvas" xmlns:cx="http://schemas.microsoft.com/office/drawing/2014/chartex" xmlns:cx1="http://schemas.microsoft.com/office/drawing/2015/9/8/chartex" xmlns:cx2="http://schemas.microsoft.com/office/drawing/2015/10/21/chartex" xmlns:cx3="http://schemas.microsoft.com/office/drawing/2016/5/9/chartex" xmlns:cx4="http://schemas.microsoft.com/office/drawing/2016/5/10/chartex" xmlns:cx5="http://schemas.microsoft.com/office/drawing/2016/5/11/chartex" xmlns:cx6="http://schemas.microsoft.com/office/drawing/2016/5/12/chartex" xmlns:cx7="http://schemas.microsoft.com/office/drawing/2016/5/13/chartex" xmlns:cx8="http://schemas.microsoft.com/office/drawing/2016/5/14/chartex" xmlns:mc="http://schemas.openxmlformats.org/markup-compatibility/2006" xmlns:aink="http://schemas.microsoft.com/office/drawing/2016/ink" xmlns:am3d="http://schemas.microsoft.com/office/drawing/2017/model3d" xmlns:o="urn:schemas-microsoft-com:office:office" xmlns:r="http://schemas.openxmlformats.org/officeDocument/2006/relationships" xmlns:m="http://schemas.openxmlformats.org/officeDocument/2006/math" xmlns:v="urn:schemas-microsoft-com:vml" xmlns:wp14="http://schemas.microsoft.com/office/word/2010/wordprocessingDrawing" xmlns:wp="http://schemas.openxmlformats.org/drawingml/2006/wordprocessingDrawing" xmlns:w10="urn:schemas-microsoft-com:office:word" xmlns:w="http://schemas.openxmlformats.org/wordprocessingml/2006/main" xmlns:w14="http://schemas.microsoft.com/office/word/2010/wordml" xmlns:w15="http://schemas.microsoft.com/office/word/2012/wordml" xmlns:w16cex="http://schemas.microsoft.com/office/word/2018/wordml/cex" xmlns:w16cid="http://schemas.microsoft.com/office/word/2016/wordml/cid" xmlns:w16="http://schemas.microsoft.com/office/word/2018/wordml" xmlns:w16sdtdh="http://schemas.microsoft.com/office/word/2020/wordml/sdtdatahash" xmlns:w16se="http://schemas.microsoft.com/office/word/2015/wordml/symex" xmlns:wpg="http://schemas.microsoft.com/office/word/2010/wordprocessingGroup" xmlns:wpi="http://schemas.microsoft.com/office/word/2010/wordprocessingInk" xmlns:wne="http://schemas.microsoft.com/office/word/2006/wordml" xmlns:wps="http://schemas.microsoft.com/office/word/2010/wordprocessingShape" mc:Ignorable="w14 w15 w16se w16cid w16 w16cex w16sdtdh wp14">
   <w:body>
     <w:p>
       <w:pPr>
@@ -153,7 +153,23 @@
           <w:sz w:val="24"/>
           <w:szCs w:val="24"/>
         </w:rPr>
-        <w:t>Напряжения и напряжённое состояние в токе тела.</w:t>
+        <w:t>Напряжения и напряжённое состояние в то</w:t>
+      </w:r>
+      <w:r>
+        <w:rPr>
+          <w:rFonts w:ascii="Times New Roman" w:hAnsi="Times New Roman" w:cs="Times New Roman"/>
+          <w:sz w:val="24"/>
+          <w:szCs w:val="24"/>
+        </w:rPr>
+        <w:t>ч</w:t>
+      </w:r>
+      <w:r>
+        <w:rPr>
+          <w:rFonts w:ascii="Times New Roman" w:hAnsi="Times New Roman" w:cs="Times New Roman"/>
+          <w:sz w:val="24"/>
+          <w:szCs w:val="24"/>
+        </w:rPr>
+        <w:t>ке тела.</w:t>
       </w:r>
     </w:p>
     <w:p>
@@ -897,7 +913,25 @@
           <w:sz w:val="24"/>
           <w:szCs w:val="24"/>
         </w:rPr>
-        <w:t>Деление тензора напряжений на шаровую и девиаторную составляющие.</w:t>
+        <w:t xml:space="preserve">Деление тензора напряжений на шаровую и </w:t>
+      </w:r>
+      <w:proofErr w:type="spellStart"/>
+      <w:r>
+        <w:rPr>
+          <w:rFonts w:ascii="Times New Roman" w:hAnsi="Times New Roman" w:cs="Times New Roman"/>
+          <w:sz w:val="24"/>
+          <w:szCs w:val="24"/>
+        </w:rPr>
+        <w:t>девиаторную</w:t>
+      </w:r>
+      <w:proofErr w:type="spellEnd"/>
+      <w:r>
+        <w:rPr>
+          <w:rFonts w:ascii="Times New Roman" w:hAnsi="Times New Roman" w:cs="Times New Roman"/>
+          <w:sz w:val="24"/>
+          <w:szCs w:val="24"/>
+        </w:rPr>
+        <w:t xml:space="preserve"> составляющие.</w:t>
       </w:r>
     </w:p>
     <w:p>
@@ -1163,11 +1197,21 @@
           <w:sz w:val="24"/>
           <w:szCs w:val="24"/>
         </w:rPr>
-        <w:t xml:space="preserve"> О взаимосвязи деформаций. </w:t>
-      </w:r>
-      <w:r>
-        <w:rPr>
-          <w:rFonts w:ascii="Times New Roman" w:hAnsi="Times New Roman" w:cs="Times New Roman"/>
+        <w:t xml:space="preserve"> </w:t>
+      </w:r>
+      <w:r>
+        <w:rPr>
+          <w:rFonts w:ascii="Times New Roman" w:hAnsi="Times New Roman" w:cs="Times New Roman"/>
+          <w:strike/>
+          <w:sz w:val="24"/>
+          <w:szCs w:val="24"/>
+        </w:rPr>
+        <w:t xml:space="preserve">О взаимосвязи деформаций. </w:t>
+      </w:r>
+      <w:r>
+        <w:rPr>
+          <w:rFonts w:ascii="Times New Roman" w:hAnsi="Times New Roman" w:cs="Times New Roman"/>
+          <w:strike/>
           <w:sz w:val="24"/>
           <w:szCs w:val="24"/>
         </w:rPr>
@@ -1261,7 +1305,25 @@
           <w:sz w:val="24"/>
           <w:szCs w:val="24"/>
         </w:rPr>
-        <w:t xml:space="preserve"> Бельтрами-Митчела, </w:t>
+        <w:t xml:space="preserve"> Бельтрами-</w:t>
+      </w:r>
+      <w:proofErr w:type="spellStart"/>
+      <w:r>
+        <w:rPr>
+          <w:rFonts w:ascii="Times New Roman" w:hAnsi="Times New Roman" w:cs="Times New Roman"/>
+          <w:sz w:val="24"/>
+          <w:szCs w:val="24"/>
+        </w:rPr>
+        <w:t>Митчела</w:t>
+      </w:r>
+      <w:proofErr w:type="spellEnd"/>
+      <w:r>
+        <w:rPr>
+          <w:rFonts w:ascii="Times New Roman" w:hAnsi="Times New Roman" w:cs="Times New Roman"/>
+          <w:sz w:val="24"/>
+          <w:szCs w:val="24"/>
+        </w:rPr>
+        <w:t xml:space="preserve">, </w:t>
       </w:r>
       <w:r>
         <w:rPr>
@@ -1450,13 +1512,23 @@
         </w:rPr>
         <w:t>-</w:t>
       </w:r>
-      <w:r>
-        <w:rPr>
-          <w:rFonts w:ascii="Times New Roman" w:hAnsi="Times New Roman" w:cs="Times New Roman"/>
-          <w:sz w:val="24"/>
-          <w:szCs w:val="24"/>
-        </w:rPr>
-        <w:t>Веннана.</w:t>
+      <w:proofErr w:type="spellStart"/>
+      <w:r>
+        <w:rPr>
+          <w:rFonts w:ascii="Times New Roman" w:hAnsi="Times New Roman" w:cs="Times New Roman"/>
+          <w:sz w:val="24"/>
+          <w:szCs w:val="24"/>
+        </w:rPr>
+        <w:t>Веннана</w:t>
+      </w:r>
+      <w:proofErr w:type="spellEnd"/>
+      <w:r>
+        <w:rPr>
+          <w:rFonts w:ascii="Times New Roman" w:hAnsi="Times New Roman" w:cs="Times New Roman"/>
+          <w:sz w:val="24"/>
+          <w:szCs w:val="24"/>
+        </w:rPr>
+        <w:t>.</w:t>
       </w:r>
     </w:p>
     <w:p>
@@ -1618,15 +1690,7 @@
           <w:sz w:val="24"/>
           <w:szCs w:val="24"/>
         </w:rPr>
-        <w:t>линейно-упругого тела</w:t>
-      </w:r>
-      <w:r>
-        <w:rPr>
-          <w:rFonts w:ascii="Times New Roman" w:hAnsi="Times New Roman" w:cs="Times New Roman"/>
-          <w:sz w:val="24"/>
-          <w:szCs w:val="24"/>
-        </w:rPr>
-        <w:t xml:space="preserve"> </w:t>
+        <w:t xml:space="preserve">линейно-упругого тела </w:t>
       </w:r>
       <w:r>
         <w:rPr>
@@ -1733,13 +1797,15 @@
         <w:jc w:val="both"/>
         <w:rPr>
           <w:rFonts w:ascii="Times New Roman" w:hAnsi="Times New Roman" w:cs="Times New Roman"/>
-          <w:sz w:val="24"/>
-          <w:szCs w:val="24"/>
-        </w:rPr>
-      </w:pPr>
-      <w:r>
-        <w:rPr>
-          <w:rFonts w:ascii="Times New Roman" w:hAnsi="Times New Roman" w:cs="Times New Roman"/>
+          <w:strike/>
+          <w:sz w:val="24"/>
+          <w:szCs w:val="24"/>
+        </w:rPr>
+      </w:pPr>
+      <w:r>
+        <w:rPr>
+          <w:rFonts w:ascii="Times New Roman" w:hAnsi="Times New Roman" w:cs="Times New Roman"/>
+          <w:strike/>
           <w:sz w:val="24"/>
           <w:szCs w:val="24"/>
         </w:rPr>
@@ -1748,6 +1814,7 @@
       <w:r>
         <w:rPr>
           <w:rFonts w:ascii="Times New Roman" w:hAnsi="Times New Roman" w:cs="Times New Roman"/>
+          <w:strike/>
           <w:sz w:val="24"/>
           <w:szCs w:val="24"/>
         </w:rPr>
@@ -1756,6 +1823,7 @@
       <w:r>
         <w:rPr>
           <w:rFonts w:ascii="Times New Roman" w:hAnsi="Times New Roman" w:cs="Times New Roman"/>
+          <w:strike/>
           <w:sz w:val="24"/>
           <w:szCs w:val="24"/>
         </w:rPr>
@@ -1764,6 +1832,7 @@
       <w:r>
         <w:rPr>
           <w:rFonts w:ascii="Times New Roman" w:hAnsi="Times New Roman" w:cs="Times New Roman"/>
+          <w:strike/>
           <w:sz w:val="24"/>
           <w:szCs w:val="24"/>
         </w:rPr>
@@ -1772,16 +1841,16 @@
       <w:r>
         <w:rPr>
           <w:rFonts w:ascii="Times New Roman" w:hAnsi="Times New Roman" w:cs="Times New Roman"/>
+          <w:strike/>
           <w:sz w:val="24"/>
           <w:szCs w:val="24"/>
         </w:rPr>
         <w:t xml:space="preserve"> и т.п</w:t>
       </w:r>
-      <w:bookmarkStart w:id="0" w:name="_GoBack"/>
-      <w:bookmarkEnd w:id="0"/>
-      <w:r>
-        <w:rPr>
-          <w:rFonts w:ascii="Times New Roman" w:hAnsi="Times New Roman" w:cs="Times New Roman"/>
+      <w:r>
+        <w:rPr>
+          <w:rFonts w:ascii="Times New Roman" w:hAnsi="Times New Roman" w:cs="Times New Roman"/>
+          <w:strike/>
           <w:sz w:val="24"/>
           <w:szCs w:val="24"/>
         </w:rPr>
@@ -1812,6 +1881,7 @@
         <w:rPr>
           <w:rFonts w:ascii="Times New Roman" w:hAnsi="Times New Roman" w:cs="Times New Roman"/>
           <w:b/>
+          <w:strike/>
           <w:sz w:val="24"/>
           <w:szCs w:val="24"/>
         </w:rPr>
@@ -1820,6 +1890,7 @@
         <w:rPr>
           <w:rFonts w:ascii="Times New Roman" w:hAnsi="Times New Roman" w:cs="Times New Roman"/>
           <w:b/>
+          <w:strike/>
           <w:sz w:val="24"/>
           <w:szCs w:val="24"/>
         </w:rPr>
@@ -1829,6 +1900,7 @@
         <w:rPr>
           <w:rFonts w:ascii="Times New Roman" w:hAnsi="Times New Roman" w:cs="Times New Roman"/>
           <w:b/>
+          <w:strike/>
           <w:sz w:val="24"/>
           <w:szCs w:val="24"/>
         </w:rPr>
@@ -1838,6 +1910,7 @@
         <w:rPr>
           <w:rFonts w:ascii="Times New Roman" w:hAnsi="Times New Roman" w:cs="Times New Roman"/>
           <w:b/>
+          <w:strike/>
           <w:sz w:val="24"/>
           <w:szCs w:val="24"/>
         </w:rPr>
@@ -1853,6 +1926,7 @@
         <w:jc w:val="both"/>
         <w:rPr>
           <w:rFonts w:ascii="Times New Roman" w:hAnsi="Times New Roman" w:cs="Times New Roman"/>
+          <w:strike/>
           <w:sz w:val="24"/>
           <w:szCs w:val="24"/>
         </w:rPr>
@@ -1874,13 +1948,15 @@
         <w:jc w:val="both"/>
         <w:rPr>
           <w:rFonts w:ascii="Times New Roman" w:hAnsi="Times New Roman" w:cs="Times New Roman"/>
-          <w:sz w:val="24"/>
-          <w:szCs w:val="24"/>
-        </w:rPr>
-      </w:pPr>
-      <w:r>
-        <w:rPr>
-          <w:rFonts w:ascii="Times New Roman" w:hAnsi="Times New Roman" w:cs="Times New Roman"/>
+          <w:strike/>
+          <w:sz w:val="24"/>
+          <w:szCs w:val="24"/>
+        </w:rPr>
+      </w:pPr>
+      <w:r>
+        <w:rPr>
+          <w:rFonts w:ascii="Times New Roman" w:hAnsi="Times New Roman" w:cs="Times New Roman"/>
+          <w:strike/>
           <w:sz w:val="24"/>
           <w:szCs w:val="24"/>
         </w:rPr>
@@ -1889,6 +1965,7 @@
       <w:r>
         <w:rPr>
           <w:rFonts w:ascii="Times New Roman" w:hAnsi="Times New Roman" w:cs="Times New Roman"/>
+          <w:strike/>
           <w:sz w:val="24"/>
           <w:szCs w:val="24"/>
         </w:rPr>
@@ -1897,6 +1974,7 @@
       <w:r>
         <w:rPr>
           <w:rFonts w:ascii="Times New Roman" w:hAnsi="Times New Roman" w:cs="Times New Roman"/>
+          <w:strike/>
           <w:sz w:val="24"/>
           <w:szCs w:val="24"/>
         </w:rPr>
@@ -1905,6 +1983,7 @@
       <w:r>
         <w:rPr>
           <w:rFonts w:ascii="Times New Roman" w:hAnsi="Times New Roman" w:cs="Times New Roman"/>
+          <w:strike/>
           <w:sz w:val="24"/>
           <w:szCs w:val="24"/>
         </w:rPr>
@@ -1913,6 +1992,7 @@
       <w:r>
         <w:rPr>
           <w:rFonts w:ascii="Times New Roman" w:hAnsi="Times New Roman" w:cs="Times New Roman"/>
+          <w:strike/>
           <w:sz w:val="24"/>
           <w:szCs w:val="24"/>
         </w:rPr>
@@ -1934,15 +2014,15 @@
         <w:jc w:val="both"/>
         <w:rPr>
           <w:rFonts w:ascii="Times New Roman" w:hAnsi="Times New Roman" w:cs="Times New Roman"/>
-          <w:color w:val="FF0000"/>
-          <w:sz w:val="24"/>
-          <w:szCs w:val="24"/>
-        </w:rPr>
-      </w:pPr>
-      <w:r>
-        <w:rPr>
-          <w:rFonts w:ascii="Times New Roman" w:hAnsi="Times New Roman" w:cs="Times New Roman"/>
-          <w:color w:val="FF0000"/>
+          <w:strike/>
+          <w:sz w:val="24"/>
+          <w:szCs w:val="24"/>
+        </w:rPr>
+      </w:pPr>
+      <w:r>
+        <w:rPr>
+          <w:rFonts w:ascii="Times New Roman" w:hAnsi="Times New Roman" w:cs="Times New Roman"/>
+          <w:strike/>
           <w:sz w:val="24"/>
           <w:szCs w:val="24"/>
         </w:rPr>
@@ -1951,7 +2031,7 @@
       <w:r>
         <w:rPr>
           <w:rFonts w:ascii="Times New Roman" w:hAnsi="Times New Roman" w:cs="Times New Roman"/>
-          <w:color w:val="FF0000"/>
+          <w:strike/>
           <w:sz w:val="24"/>
           <w:szCs w:val="24"/>
         </w:rPr>
@@ -1960,7 +2040,7 @@
       <w:r>
         <w:rPr>
           <w:rFonts w:ascii="Times New Roman" w:hAnsi="Times New Roman" w:cs="Times New Roman"/>
-          <w:color w:val="FF0000"/>
+          <w:strike/>
           <w:sz w:val="24"/>
           <w:szCs w:val="24"/>
         </w:rPr>
@@ -1969,7 +2049,7 @@
       <w:r>
         <w:rPr>
           <w:rFonts w:ascii="Times New Roman" w:hAnsi="Times New Roman" w:cs="Times New Roman"/>
-          <w:color w:val="FF0000"/>
+          <w:strike/>
           <w:sz w:val="24"/>
           <w:szCs w:val="24"/>
         </w:rPr>
@@ -1978,7 +2058,7 @@
       <w:r>
         <w:rPr>
           <w:rFonts w:ascii="Times New Roman" w:hAnsi="Times New Roman" w:cs="Times New Roman"/>
-          <w:color w:val="FF0000"/>
+          <w:strike/>
           <w:sz w:val="24"/>
           <w:szCs w:val="24"/>
         </w:rPr>
@@ -1987,7 +2067,7 @@
       <w:r>
         <w:rPr>
           <w:rFonts w:ascii="Times New Roman" w:hAnsi="Times New Roman" w:cs="Times New Roman"/>
-          <w:color w:val="FF0000"/>
+          <w:strike/>
           <w:sz w:val="24"/>
           <w:szCs w:val="24"/>
         </w:rPr>
@@ -1996,7 +2076,7 @@
       <w:r>
         <w:rPr>
           <w:rFonts w:ascii="Times New Roman" w:hAnsi="Times New Roman" w:cs="Times New Roman"/>
-          <w:color w:val="FF0000"/>
+          <w:strike/>
           <w:sz w:val="24"/>
           <w:szCs w:val="24"/>
         </w:rPr>
@@ -2018,15 +2098,15 @@
         <w:jc w:val="both"/>
         <w:rPr>
           <w:rFonts w:ascii="Times New Roman" w:hAnsi="Times New Roman" w:cs="Times New Roman"/>
-          <w:color w:val="FF0000"/>
-          <w:sz w:val="24"/>
-          <w:szCs w:val="24"/>
-        </w:rPr>
-      </w:pPr>
-      <w:r>
-        <w:rPr>
-          <w:rFonts w:ascii="Times New Roman" w:hAnsi="Times New Roman" w:cs="Times New Roman"/>
-          <w:color w:val="FF0000"/>
+          <w:strike/>
+          <w:sz w:val="24"/>
+          <w:szCs w:val="24"/>
+        </w:rPr>
+      </w:pPr>
+      <w:r>
+        <w:rPr>
+          <w:rFonts w:ascii="Times New Roman" w:hAnsi="Times New Roman" w:cs="Times New Roman"/>
+          <w:strike/>
           <w:sz w:val="24"/>
           <w:szCs w:val="24"/>
         </w:rPr>
@@ -2035,7 +2115,7 @@
       <w:r>
         <w:rPr>
           <w:rFonts w:ascii="Times New Roman" w:hAnsi="Times New Roman" w:cs="Times New Roman"/>
-          <w:color w:val="FF0000"/>
+          <w:strike/>
           <w:sz w:val="24"/>
           <w:szCs w:val="24"/>
         </w:rPr>
@@ -2044,7 +2124,7 @@
       <w:r>
         <w:rPr>
           <w:rFonts w:ascii="Times New Roman" w:hAnsi="Times New Roman" w:cs="Times New Roman"/>
-          <w:color w:val="FF0000"/>
+          <w:strike/>
           <w:sz w:val="24"/>
           <w:szCs w:val="24"/>
         </w:rPr>
@@ -2066,15 +2146,15 @@
         <w:jc w:val="both"/>
         <w:rPr>
           <w:rFonts w:ascii="Times New Roman" w:hAnsi="Times New Roman" w:cs="Times New Roman"/>
-          <w:color w:val="FF0000"/>
-          <w:sz w:val="24"/>
-          <w:szCs w:val="24"/>
-        </w:rPr>
-      </w:pPr>
-      <w:r>
-        <w:rPr>
-          <w:rFonts w:ascii="Times New Roman" w:hAnsi="Times New Roman" w:cs="Times New Roman"/>
-          <w:color w:val="FF0000"/>
+          <w:strike/>
+          <w:sz w:val="24"/>
+          <w:szCs w:val="24"/>
+        </w:rPr>
+      </w:pPr>
+      <w:r>
+        <w:rPr>
+          <w:rFonts w:ascii="Times New Roman" w:hAnsi="Times New Roman" w:cs="Times New Roman"/>
+          <w:strike/>
           <w:sz w:val="24"/>
           <w:szCs w:val="24"/>
         </w:rPr>
@@ -2083,7 +2163,7 @@
       <w:r>
         <w:rPr>
           <w:rFonts w:ascii="Times New Roman" w:hAnsi="Times New Roman" w:cs="Times New Roman"/>
-          <w:color w:val="FF0000"/>
+          <w:strike/>
           <w:sz w:val="24"/>
           <w:szCs w:val="24"/>
         </w:rPr>
@@ -2092,7 +2172,7 @@
       <w:r>
         <w:rPr>
           <w:rFonts w:ascii="Times New Roman" w:hAnsi="Times New Roman" w:cs="Times New Roman"/>
-          <w:color w:val="FF0000"/>
+          <w:strike/>
           <w:sz w:val="24"/>
           <w:szCs w:val="24"/>
         </w:rPr>
@@ -2101,7 +2181,7 @@
       <w:r>
         <w:rPr>
           <w:rFonts w:ascii="Times New Roman" w:hAnsi="Times New Roman" w:cs="Times New Roman"/>
-          <w:color w:val="FF0000"/>
+          <w:strike/>
           <w:sz w:val="24"/>
           <w:szCs w:val="24"/>
         </w:rPr>
@@ -2110,7 +2190,7 @@
       <w:r>
         <w:rPr>
           <w:rFonts w:ascii="Times New Roman" w:hAnsi="Times New Roman" w:cs="Times New Roman"/>
-          <w:color w:val="FF0000"/>
+          <w:strike/>
           <w:sz w:val="24"/>
           <w:szCs w:val="24"/>
         </w:rPr>
@@ -2132,42 +2212,24 @@
         <w:jc w:val="both"/>
         <w:rPr>
           <w:rFonts w:ascii="Times New Roman" w:hAnsi="Times New Roman" w:cs="Times New Roman"/>
-          <w:color w:val="FF0000"/>
-          <w:sz w:val="24"/>
-          <w:szCs w:val="24"/>
-        </w:rPr>
-      </w:pPr>
-      <w:r>
-        <w:rPr>
-          <w:rFonts w:ascii="Times New Roman" w:hAnsi="Times New Roman" w:cs="Times New Roman"/>
-          <w:color w:val="FF0000"/>
-          <w:sz w:val="24"/>
-          <w:szCs w:val="24"/>
-        </w:rPr>
-        <w:t>Приведение различных по типу сил</w:t>
-      </w:r>
-      <w:r>
-        <w:rPr>
-          <w:rFonts w:ascii="Times New Roman" w:hAnsi="Times New Roman" w:cs="Times New Roman"/>
-          <w:color w:val="FF0000"/>
-          <w:sz w:val="24"/>
-          <w:szCs w:val="24"/>
-        </w:rPr>
-        <w:t>овых факторов</w:t>
-      </w:r>
-      <w:r>
-        <w:rPr>
-          <w:rFonts w:ascii="Times New Roman" w:hAnsi="Times New Roman" w:cs="Times New Roman"/>
-          <w:color w:val="FF0000"/>
-          <w:sz w:val="24"/>
-          <w:szCs w:val="24"/>
-        </w:rPr>
-        <w:t xml:space="preserve"> к узлам конечно-элементной модели</w:t>
-      </w:r>
-      <w:r>
-        <w:rPr>
-          <w:rFonts w:ascii="Times New Roman" w:hAnsi="Times New Roman" w:cs="Times New Roman"/>
-          <w:color w:val="FF0000"/>
+          <w:strike/>
+          <w:sz w:val="24"/>
+          <w:szCs w:val="24"/>
+        </w:rPr>
+      </w:pPr>
+      <w:r>
+        <w:rPr>
+          <w:rFonts w:ascii="Times New Roman" w:hAnsi="Times New Roman" w:cs="Times New Roman"/>
+          <w:strike/>
+          <w:sz w:val="24"/>
+          <w:szCs w:val="24"/>
+        </w:rPr>
+        <w:t>Приведение различных по типу силовых факторов к узлам конечно-элементной модели</w:t>
+      </w:r>
+      <w:r>
+        <w:rPr>
+          <w:rFonts w:ascii="Times New Roman" w:hAnsi="Times New Roman" w:cs="Times New Roman"/>
+          <w:strike/>
           <w:sz w:val="24"/>
           <w:szCs w:val="24"/>
         </w:rPr>
@@ -2176,7 +2238,7 @@
       <w:r>
         <w:rPr>
           <w:rFonts w:ascii="Times New Roman" w:hAnsi="Times New Roman" w:cs="Times New Roman"/>
-          <w:color w:val="FF0000"/>
+          <w:strike/>
           <w:sz w:val="24"/>
           <w:szCs w:val="24"/>
         </w:rPr>
@@ -2198,60 +2260,51 @@
         <w:jc w:val="both"/>
         <w:rPr>
           <w:rFonts w:ascii="Times New Roman" w:hAnsi="Times New Roman" w:cs="Times New Roman"/>
-          <w:color w:val="FF0000"/>
-          <w:sz w:val="24"/>
-          <w:szCs w:val="24"/>
-        </w:rPr>
-      </w:pPr>
-      <w:r>
-        <w:rPr>
-          <w:rFonts w:ascii="Times New Roman" w:hAnsi="Times New Roman" w:cs="Times New Roman"/>
-          <w:color w:val="FF0000"/>
-          <w:sz w:val="24"/>
-          <w:szCs w:val="24"/>
-        </w:rPr>
-        <w:t xml:space="preserve">Формирование глобальных </w:t>
-      </w:r>
-      <w:r>
-        <w:rPr>
-          <w:rFonts w:ascii="Times New Roman" w:hAnsi="Times New Roman" w:cs="Times New Roman"/>
-          <w:color w:val="FF0000"/>
-          <w:sz w:val="24"/>
-          <w:szCs w:val="24"/>
-        </w:rPr>
-        <w:t>векторов узловых</w:t>
-      </w:r>
-      <w:r>
-        <w:rPr>
-          <w:rFonts w:ascii="Times New Roman" w:hAnsi="Times New Roman" w:cs="Times New Roman"/>
-          <w:color w:val="FF0000"/>
-          <w:sz w:val="24"/>
-          <w:szCs w:val="24"/>
-        </w:rPr>
-        <w:t xml:space="preserve"> перемещений и</w:t>
-      </w:r>
-      <w:r>
-        <w:rPr>
-          <w:rFonts w:ascii="Times New Roman" w:hAnsi="Times New Roman" w:cs="Times New Roman"/>
-          <w:color w:val="FF0000"/>
-          <w:sz w:val="24"/>
-          <w:szCs w:val="24"/>
-        </w:rPr>
-        <w:t xml:space="preserve"> нагрузок</w:t>
-      </w:r>
-      <w:r>
-        <w:rPr>
-          <w:rFonts w:ascii="Times New Roman" w:hAnsi="Times New Roman" w:cs="Times New Roman"/>
-          <w:color w:val="FF0000"/>
-          <w:sz w:val="24"/>
-          <w:szCs w:val="24"/>
-        </w:rPr>
-        <w:t>.</w:t>
-      </w:r>
-      <w:r>
-        <w:rPr>
-          <w:rFonts w:ascii="Times New Roman" w:hAnsi="Times New Roman" w:cs="Times New Roman"/>
-          <w:color w:val="FF0000"/>
+          <w:strike/>
+          <w:sz w:val="24"/>
+          <w:szCs w:val="24"/>
+        </w:rPr>
+      </w:pPr>
+      <w:r>
+        <w:rPr>
+          <w:rFonts w:ascii="Times New Roman" w:hAnsi="Times New Roman" w:cs="Times New Roman"/>
+          <w:strike/>
+          <w:sz w:val="24"/>
+          <w:szCs w:val="24"/>
+        </w:rPr>
+        <w:t>Формирование глобальных векторов узловых перемещений и нагрузок</w:t>
+      </w:r>
+      <w:r>
+        <w:rPr>
+          <w:rFonts w:ascii="Times New Roman" w:hAnsi="Times New Roman" w:cs="Times New Roman"/>
+          <w:strike/>
+          <w:sz w:val="24"/>
+          <w:szCs w:val="24"/>
+        </w:rPr>
+        <w:t xml:space="preserve">. </w:t>
+      </w:r>
+      <w:r>
+        <w:rPr>
+          <w:rFonts w:ascii="Times New Roman" w:hAnsi="Times New Roman" w:cs="Times New Roman"/>
+          <w:strike/>
+          <w:sz w:val="24"/>
+          <w:szCs w:val="24"/>
+        </w:rPr>
+        <w:t>Уравнения равновесия узлов модели, формирование глобальн</w:t>
+      </w:r>
+      <w:r>
+        <w:rPr>
+          <w:rFonts w:ascii="Times New Roman" w:hAnsi="Times New Roman" w:cs="Times New Roman"/>
+          <w:strike/>
+          <w:sz w:val="24"/>
+          <w:szCs w:val="24"/>
+        </w:rPr>
+        <w:t>ой</w:t>
+      </w:r>
+      <w:r>
+        <w:rPr>
+          <w:rFonts w:ascii="Times New Roman" w:hAnsi="Times New Roman" w:cs="Times New Roman"/>
+          <w:strike/>
           <w:sz w:val="24"/>
           <w:szCs w:val="24"/>
         </w:rPr>
@@ -2260,34 +2313,7 @@
       <w:r>
         <w:rPr>
           <w:rFonts w:ascii="Times New Roman" w:hAnsi="Times New Roman" w:cs="Times New Roman"/>
-          <w:color w:val="FF0000"/>
-          <w:sz w:val="24"/>
-          <w:szCs w:val="24"/>
-        </w:rPr>
-        <w:t>Уравнения равновесия узлов модели, формирование глобальн</w:t>
-      </w:r>
-      <w:r>
-        <w:rPr>
-          <w:rFonts w:ascii="Times New Roman" w:hAnsi="Times New Roman" w:cs="Times New Roman"/>
-          <w:color w:val="FF0000"/>
-          <w:sz w:val="24"/>
-          <w:szCs w:val="24"/>
-        </w:rPr>
-        <w:t>ой</w:t>
-      </w:r>
-      <w:r>
-        <w:rPr>
-          <w:rFonts w:ascii="Times New Roman" w:hAnsi="Times New Roman" w:cs="Times New Roman"/>
-          <w:color w:val="FF0000"/>
-          <w:sz w:val="24"/>
-          <w:szCs w:val="24"/>
-        </w:rPr>
-        <w:t xml:space="preserve"> </w:t>
-      </w:r>
-      <w:r>
-        <w:rPr>
-          <w:rFonts w:ascii="Times New Roman" w:hAnsi="Times New Roman" w:cs="Times New Roman"/>
-          <w:color w:val="FF0000"/>
+          <w:strike/>
           <w:sz w:val="24"/>
           <w:szCs w:val="24"/>
         </w:rPr>
@@ -2296,43 +2322,16 @@
       <w:r>
         <w:rPr>
           <w:rFonts w:ascii="Times New Roman" w:hAnsi="Times New Roman" w:cs="Times New Roman"/>
-          <w:color w:val="FF0000"/>
-          <w:sz w:val="24"/>
-          <w:szCs w:val="24"/>
-        </w:rPr>
-        <w:t xml:space="preserve"> и </w:t>
-      </w:r>
-      <w:r>
-        <w:rPr>
-          <w:rFonts w:ascii="Times New Roman" w:hAnsi="Times New Roman" w:cs="Times New Roman"/>
-          <w:color w:val="FF0000"/>
-          <w:sz w:val="24"/>
-          <w:szCs w:val="24"/>
-        </w:rPr>
-        <w:t xml:space="preserve">канонического уравнения </w:t>
-      </w:r>
-      <w:r>
-        <w:rPr>
-          <w:rFonts w:ascii="Times New Roman" w:hAnsi="Times New Roman" w:cs="Times New Roman"/>
-          <w:color w:val="FF0000"/>
-          <w:sz w:val="24"/>
-          <w:szCs w:val="24"/>
-        </w:rPr>
-        <w:t>МКЭ</w:t>
-      </w:r>
-      <w:r>
-        <w:rPr>
-          <w:rFonts w:ascii="Times New Roman" w:hAnsi="Times New Roman" w:cs="Times New Roman"/>
-          <w:color w:val="FF0000"/>
-          <w:sz w:val="24"/>
-          <w:szCs w:val="24"/>
-        </w:rPr>
-        <w:t xml:space="preserve"> (вывод соотношений)</w:t>
-      </w:r>
-      <w:r>
-        <w:rPr>
-          <w:rFonts w:ascii="Times New Roman" w:hAnsi="Times New Roman" w:cs="Times New Roman"/>
-          <w:color w:val="FF0000"/>
+          <w:strike/>
+          <w:sz w:val="24"/>
+          <w:szCs w:val="24"/>
+        </w:rPr>
+        <w:t xml:space="preserve"> и канонического уравнения МКЭ (вывод соотношений)</w:t>
+      </w:r>
+      <w:r>
+        <w:rPr>
+          <w:rFonts w:ascii="Times New Roman" w:hAnsi="Times New Roman" w:cs="Times New Roman"/>
+          <w:strike/>
           <w:sz w:val="24"/>
           <w:szCs w:val="24"/>
         </w:rPr>
@@ -2354,15 +2353,15 @@
         <w:jc w:val="both"/>
         <w:rPr>
           <w:rFonts w:ascii="Times New Roman" w:hAnsi="Times New Roman" w:cs="Times New Roman"/>
-          <w:color w:val="FF0000"/>
-          <w:sz w:val="24"/>
-          <w:szCs w:val="24"/>
-        </w:rPr>
-      </w:pPr>
-      <w:r>
-        <w:rPr>
-          <w:rFonts w:ascii="Times New Roman" w:hAnsi="Times New Roman" w:cs="Times New Roman"/>
-          <w:color w:val="FF0000"/>
+          <w:strike/>
+          <w:sz w:val="24"/>
+          <w:szCs w:val="24"/>
+        </w:rPr>
+      </w:pPr>
+      <w:r>
+        <w:rPr>
+          <w:rFonts w:ascii="Times New Roman" w:hAnsi="Times New Roman" w:cs="Times New Roman"/>
+          <w:strike/>
           <w:sz w:val="24"/>
           <w:szCs w:val="24"/>
         </w:rPr>
@@ -2371,7 +2370,7 @@
       <w:r>
         <w:rPr>
           <w:rFonts w:ascii="Times New Roman" w:hAnsi="Times New Roman" w:cs="Times New Roman"/>
-          <w:color w:val="FF0000"/>
+          <w:strike/>
           <w:sz w:val="24"/>
           <w:szCs w:val="24"/>
         </w:rPr>
@@ -2380,7 +2379,7 @@
       <w:r>
         <w:rPr>
           <w:rFonts w:ascii="Times New Roman" w:hAnsi="Times New Roman" w:cs="Times New Roman"/>
-          <w:color w:val="FF0000"/>
+          <w:strike/>
           <w:sz w:val="24"/>
           <w:szCs w:val="24"/>
         </w:rPr>
@@ -2389,7 +2388,7 @@
       <w:r>
         <w:rPr>
           <w:rFonts w:ascii="Times New Roman" w:hAnsi="Times New Roman" w:cs="Times New Roman"/>
-          <w:color w:val="FF0000"/>
+          <w:strike/>
           <w:sz w:val="24"/>
           <w:szCs w:val="24"/>
         </w:rPr>
@@ -2398,7 +2397,7 @@
       <w:r>
         <w:rPr>
           <w:rFonts w:ascii="Times New Roman" w:hAnsi="Times New Roman" w:cs="Times New Roman"/>
-          <w:color w:val="FF0000"/>
+          <w:strike/>
           <w:sz w:val="24"/>
           <w:szCs w:val="24"/>
         </w:rPr>
@@ -2407,7 +2406,7 @@
       <w:r>
         <w:rPr>
           <w:rFonts w:ascii="Times New Roman" w:hAnsi="Times New Roman" w:cs="Times New Roman"/>
-          <w:color w:val="FF0000"/>
+          <w:strike/>
           <w:sz w:val="24"/>
           <w:szCs w:val="24"/>
         </w:rPr>
@@ -2416,7 +2415,7 @@
       <w:r>
         <w:rPr>
           <w:rFonts w:ascii="Times New Roman" w:hAnsi="Times New Roman" w:cs="Times New Roman"/>
-          <w:color w:val="FF0000"/>
+          <w:strike/>
           <w:sz w:val="24"/>
           <w:szCs w:val="24"/>
         </w:rPr>
@@ -2425,7 +2424,7 @@
       <w:r>
         <w:rPr>
           <w:rFonts w:ascii="Times New Roman" w:hAnsi="Times New Roman" w:cs="Times New Roman"/>
-          <w:color w:val="FF0000"/>
+          <w:strike/>
           <w:sz w:val="24"/>
           <w:szCs w:val="24"/>
         </w:rPr>
@@ -2434,7 +2433,7 @@
       <w:r>
         <w:rPr>
           <w:rFonts w:ascii="Times New Roman" w:hAnsi="Times New Roman" w:cs="Times New Roman"/>
-          <w:color w:val="FF0000"/>
+          <w:strike/>
           <w:sz w:val="24"/>
           <w:szCs w:val="24"/>
         </w:rPr>
@@ -2443,7 +2442,7 @@
       <w:r>
         <w:rPr>
           <w:rFonts w:ascii="Times New Roman" w:hAnsi="Times New Roman" w:cs="Times New Roman"/>
-          <w:color w:val="FF0000"/>
+          <w:strike/>
           <w:sz w:val="24"/>
           <w:szCs w:val="24"/>
         </w:rPr>
@@ -2465,15 +2464,15 @@
         <w:jc w:val="both"/>
         <w:rPr>
           <w:rFonts w:ascii="Times New Roman" w:hAnsi="Times New Roman" w:cs="Times New Roman"/>
-          <w:color w:val="FF0000"/>
-          <w:sz w:val="24"/>
-          <w:szCs w:val="24"/>
-        </w:rPr>
-      </w:pPr>
-      <w:r>
-        <w:rPr>
-          <w:rFonts w:ascii="Times New Roman" w:hAnsi="Times New Roman" w:cs="Times New Roman"/>
-          <w:color w:val="FF0000"/>
+          <w:strike/>
+          <w:sz w:val="24"/>
+          <w:szCs w:val="24"/>
+        </w:rPr>
+      </w:pPr>
+      <w:r>
+        <w:rPr>
+          <w:rFonts w:ascii="Times New Roman" w:hAnsi="Times New Roman" w:cs="Times New Roman"/>
+          <w:strike/>
           <w:sz w:val="24"/>
           <w:szCs w:val="24"/>
         </w:rPr>
@@ -2482,7 +2481,7 @@
       <w:r>
         <w:rPr>
           <w:rFonts w:ascii="Times New Roman" w:hAnsi="Times New Roman" w:cs="Times New Roman"/>
-          <w:color w:val="FF0000"/>
+          <w:strike/>
           <w:sz w:val="24"/>
           <w:szCs w:val="24"/>
         </w:rPr>
@@ -2491,7 +2490,7 @@
       <w:r>
         <w:rPr>
           <w:rFonts w:ascii="Times New Roman" w:hAnsi="Times New Roman" w:cs="Times New Roman"/>
-          <w:color w:val="FF0000"/>
+          <w:strike/>
           <w:sz w:val="24"/>
           <w:szCs w:val="24"/>
         </w:rPr>
@@ -2513,24 +2512,44 @@
         <w:jc w:val="both"/>
         <w:rPr>
           <w:rFonts w:ascii="Times New Roman" w:hAnsi="Times New Roman" w:cs="Times New Roman"/>
-          <w:color w:val="FF0000"/>
-          <w:sz w:val="24"/>
-          <w:szCs w:val="24"/>
-        </w:rPr>
-      </w:pPr>
-      <w:r>
-        <w:rPr>
-          <w:rFonts w:ascii="Times New Roman" w:hAnsi="Times New Roman" w:cs="Times New Roman"/>
-          <w:color w:val="FF0000"/>
-          <w:sz w:val="24"/>
-          <w:szCs w:val="24"/>
-        </w:rPr>
-        <w:t>Параметры препроцессинга и решения МКЭ, влияющие на точность/скорость расчёта</w:t>
-      </w:r>
-      <w:r>
-        <w:rPr>
-          <w:rFonts w:ascii="Times New Roman" w:hAnsi="Times New Roman" w:cs="Times New Roman"/>
-          <w:color w:val="FF0000"/>
+          <w:strike/>
+          <w:sz w:val="24"/>
+          <w:szCs w:val="24"/>
+        </w:rPr>
+      </w:pPr>
+      <w:r>
+        <w:rPr>
+          <w:rFonts w:ascii="Times New Roman" w:hAnsi="Times New Roman" w:cs="Times New Roman"/>
+          <w:strike/>
+          <w:sz w:val="24"/>
+          <w:szCs w:val="24"/>
+        </w:rPr>
+        <w:t xml:space="preserve">Параметры </w:t>
+      </w:r>
+      <w:proofErr w:type="spellStart"/>
+      <w:r>
+        <w:rPr>
+          <w:rFonts w:ascii="Times New Roman" w:hAnsi="Times New Roman" w:cs="Times New Roman"/>
+          <w:strike/>
+          <w:sz w:val="24"/>
+          <w:szCs w:val="24"/>
+        </w:rPr>
+        <w:t>препроцессинга</w:t>
+      </w:r>
+      <w:proofErr w:type="spellEnd"/>
+      <w:r>
+        <w:rPr>
+          <w:rFonts w:ascii="Times New Roman" w:hAnsi="Times New Roman" w:cs="Times New Roman"/>
+          <w:strike/>
+          <w:sz w:val="24"/>
+          <w:szCs w:val="24"/>
+        </w:rPr>
+        <w:t xml:space="preserve"> и решения МКЭ, влияющие на точность/скорость расчёта</w:t>
+      </w:r>
+      <w:r>
+        <w:rPr>
+          <w:rFonts w:ascii="Times New Roman" w:hAnsi="Times New Roman" w:cs="Times New Roman"/>
+          <w:strike/>
           <w:sz w:val="24"/>
           <w:szCs w:val="24"/>
         </w:rPr>
@@ -2552,15 +2571,15 @@
         <w:jc w:val="both"/>
         <w:rPr>
           <w:rFonts w:ascii="Times New Roman" w:hAnsi="Times New Roman" w:cs="Times New Roman"/>
-          <w:color w:val="FF0000"/>
-          <w:sz w:val="24"/>
-          <w:szCs w:val="24"/>
-        </w:rPr>
-      </w:pPr>
-      <w:r>
-        <w:rPr>
-          <w:rFonts w:ascii="Times New Roman" w:hAnsi="Times New Roman" w:cs="Times New Roman"/>
-          <w:color w:val="FF0000"/>
+          <w:strike/>
+          <w:sz w:val="24"/>
+          <w:szCs w:val="24"/>
+        </w:rPr>
+      </w:pPr>
+      <w:r>
+        <w:rPr>
+          <w:rFonts w:ascii="Times New Roman" w:hAnsi="Times New Roman" w:cs="Times New Roman"/>
+          <w:strike/>
           <w:sz w:val="24"/>
           <w:szCs w:val="24"/>
         </w:rPr>
@@ -2569,25 +2588,27 @@
       <w:r>
         <w:rPr>
           <w:rFonts w:ascii="Times New Roman" w:hAnsi="Times New Roman" w:cs="Times New Roman"/>
-          <w:color w:val="FF0000"/>
+          <w:strike/>
           <w:sz w:val="24"/>
           <w:szCs w:val="24"/>
         </w:rPr>
         <w:t xml:space="preserve">ывода матрицы жёсткости для треугольного </w:t>
       </w:r>
-      <w:r>
-        <w:rPr>
-          <w:rFonts w:ascii="Times New Roman" w:hAnsi="Times New Roman" w:cs="Times New Roman"/>
-          <w:color w:val="FF0000"/>
+      <w:proofErr w:type="spellStart"/>
+      <w:r>
+        <w:rPr>
+          <w:rFonts w:ascii="Times New Roman" w:hAnsi="Times New Roman" w:cs="Times New Roman"/>
+          <w:strike/>
           <w:sz w:val="24"/>
           <w:szCs w:val="24"/>
         </w:rPr>
         <w:t>изопараметрического</w:t>
       </w:r>
-      <w:r>
-        <w:rPr>
-          <w:rFonts w:ascii="Times New Roman" w:hAnsi="Times New Roman" w:cs="Times New Roman"/>
-          <w:color w:val="FF0000"/>
+      <w:proofErr w:type="spellEnd"/>
+      <w:r>
+        <w:rPr>
+          <w:rFonts w:ascii="Times New Roman" w:hAnsi="Times New Roman" w:cs="Times New Roman"/>
+          <w:strike/>
           <w:sz w:val="24"/>
           <w:szCs w:val="24"/>
         </w:rPr>
@@ -2596,7 +2617,7 @@
       <w:r>
         <w:rPr>
           <w:rFonts w:ascii="Times New Roman" w:hAnsi="Times New Roman" w:cs="Times New Roman"/>
-          <w:color w:val="FF0000"/>
+          <w:strike/>
           <w:sz w:val="24"/>
           <w:szCs w:val="24"/>
         </w:rPr>
@@ -2605,7 +2626,7 @@
       <w:r>
         <w:rPr>
           <w:rFonts w:ascii="Times New Roman" w:hAnsi="Times New Roman" w:cs="Times New Roman"/>
-          <w:color w:val="FF0000"/>
+          <w:strike/>
           <w:sz w:val="24"/>
           <w:szCs w:val="24"/>
         </w:rPr>
@@ -2614,7 +2635,7 @@
       <w:r>
         <w:rPr>
           <w:rFonts w:ascii="Times New Roman" w:hAnsi="Times New Roman" w:cs="Times New Roman"/>
-          <w:color w:val="FF0000"/>
+          <w:strike/>
           <w:sz w:val="24"/>
           <w:szCs w:val="24"/>
         </w:rPr>
@@ -2857,7 +2878,43 @@
           <w:sz w:val="24"/>
           <w:szCs w:val="24"/>
         </w:rPr>
-        <w:t xml:space="preserve">Теория прочности Губера–Мизеса: формулировка </w:t>
+        <w:t xml:space="preserve">Теория прочности </w:t>
+      </w:r>
+      <w:proofErr w:type="spellStart"/>
+      <w:r>
+        <w:rPr>
+          <w:rFonts w:ascii="Times New Roman" w:hAnsi="Times New Roman" w:cs="Times New Roman"/>
+          <w:sz w:val="24"/>
+          <w:szCs w:val="24"/>
+        </w:rPr>
+        <w:t>Губера</w:t>
+      </w:r>
+      <w:proofErr w:type="spellEnd"/>
+      <w:r>
+        <w:rPr>
+          <w:rFonts w:ascii="Times New Roman" w:hAnsi="Times New Roman" w:cs="Times New Roman"/>
+          <w:sz w:val="24"/>
+          <w:szCs w:val="24"/>
+        </w:rPr>
+        <w:t>–</w:t>
+      </w:r>
+      <w:proofErr w:type="spellStart"/>
+      <w:r>
+        <w:rPr>
+          <w:rFonts w:ascii="Times New Roman" w:hAnsi="Times New Roman" w:cs="Times New Roman"/>
+          <w:sz w:val="24"/>
+          <w:szCs w:val="24"/>
+        </w:rPr>
+        <w:t>Мизеса</w:t>
+      </w:r>
+      <w:proofErr w:type="spellEnd"/>
+      <w:r>
+        <w:rPr>
+          <w:rFonts w:ascii="Times New Roman" w:hAnsi="Times New Roman" w:cs="Times New Roman"/>
+          <w:sz w:val="24"/>
+          <w:szCs w:val="24"/>
+        </w:rPr>
+        <w:t xml:space="preserve">: формулировка </w:t>
       </w:r>
       <w:r>
         <w:rPr>
@@ -2891,25 +2948,19 @@
         <w:contextualSpacing w:val="0"/>
         <w:rPr>
           <w:rFonts w:ascii="Times New Roman" w:hAnsi="Times New Roman" w:cs="Times New Roman"/>
-          <w:sz w:val="24"/>
-          <w:szCs w:val="24"/>
-        </w:rPr>
-      </w:pPr>
-      <w:r>
-        <w:rPr>
-          <w:rFonts w:ascii="Times New Roman" w:hAnsi="Times New Roman" w:cs="Times New Roman"/>
-          <w:sz w:val="24"/>
-          <w:szCs w:val="24"/>
-        </w:rPr>
-        <w:t>Теория прочности Мора: базовая идея</w:t>
-      </w:r>
-      <w:r>
-        <w:rPr>
-          <w:rFonts w:ascii="Times New Roman" w:hAnsi="Times New Roman" w:cs="Times New Roman"/>
-          <w:sz w:val="24"/>
-          <w:szCs w:val="24"/>
-        </w:rPr>
-        <w:t>, вывод зависимости для эквивалентного напряжения, достоинства и недостатки.</w:t>
+          <w:strike/>
+          <w:sz w:val="24"/>
+          <w:szCs w:val="24"/>
+        </w:rPr>
+      </w:pPr>
+      <w:r>
+        <w:rPr>
+          <w:rFonts w:ascii="Times New Roman" w:hAnsi="Times New Roman" w:cs="Times New Roman"/>
+          <w:strike/>
+          <w:sz w:val="24"/>
+          <w:szCs w:val="24"/>
+        </w:rPr>
+        <w:t>Теория прочности Мора: базовая идея, вывод зависимости для эквивалентного напряжения, достоинства и недостатки.</w:t>
       </w:r>
     </w:p>
     <w:p>
@@ -2935,6 +2986,7 @@
       <w:r>
         <w:rPr>
           <w:rFonts w:ascii="Times New Roman" w:hAnsi="Times New Roman" w:cs="Times New Roman"/>
+          <w:strike/>
           <w:sz w:val="24"/>
           <w:szCs w:val="24"/>
         </w:rPr>
@@ -3025,7 +3077,47 @@
           <w:sz w:val="24"/>
           <w:szCs w:val="24"/>
         </w:rPr>
-        <w:t>Горшков А.Г., Трошин В.Н., Шалашилин В.И. Сопротивление материалов: Учеб. пособие. – 2-е изд., испр. – М.: ФИЗМАТЛИТ, 2008. – 544 с.</w:t>
+        <w:t xml:space="preserve">Горшков А.Г., Трошин В.Н., </w:t>
+      </w:r>
+      <w:proofErr w:type="spellStart"/>
+      <w:r>
+        <w:rPr>
+          <w:b w:val="0"/>
+          <w:bCs/>
+          <w:sz w:val="24"/>
+          <w:szCs w:val="24"/>
+        </w:rPr>
+        <w:t>Шалашилин</w:t>
+      </w:r>
+      <w:proofErr w:type="spellEnd"/>
+      <w:r>
+        <w:rPr>
+          <w:b w:val="0"/>
+          <w:bCs/>
+          <w:sz w:val="24"/>
+          <w:szCs w:val="24"/>
+        </w:rPr>
+        <w:t xml:space="preserve"> В.И. Сопротивление материалов: Учеб. пособие. – 2-е изд., </w:t>
+      </w:r>
+      <w:proofErr w:type="spellStart"/>
+      <w:r>
+        <w:rPr>
+          <w:b w:val="0"/>
+          <w:bCs/>
+          <w:sz w:val="24"/>
+          <w:szCs w:val="24"/>
+        </w:rPr>
+        <w:t>испр</w:t>
+      </w:r>
+      <w:proofErr w:type="spellEnd"/>
+      <w:r>
+        <w:rPr>
+          <w:b w:val="0"/>
+          <w:bCs/>
+          <w:sz w:val="24"/>
+          <w:szCs w:val="24"/>
+        </w:rPr>
+        <w:t>. – М.: ФИЗМАТЛИТ, 2008. – 544 с.</w:t>
       </w:r>
     </w:p>
     <w:p>
@@ -3079,7 +3171,27 @@
           <w:sz w:val="24"/>
           <w:szCs w:val="24"/>
         </w:rPr>
-        <w:t>Александров А.В., Потапов В.Д. Сопротивление материалов. Основы теории упругости и пластичности. Учеб. для строит. спец. вузов – 2-е изд., испр. – М.: Высшая школа, 2002. – 400 с.</w:t>
+        <w:t xml:space="preserve">Александров А.В., Потапов В.Д. Сопротивление материалов. Основы теории упругости и пластичности. Учеб. для строит. спец. вузов – 2-е изд., </w:t>
+      </w:r>
+      <w:proofErr w:type="spellStart"/>
+      <w:r>
+        <w:rPr>
+          <w:b w:val="0"/>
+          <w:bCs/>
+          <w:sz w:val="24"/>
+          <w:szCs w:val="24"/>
+        </w:rPr>
+        <w:t>испр</w:t>
+      </w:r>
+      <w:proofErr w:type="spellEnd"/>
+      <w:r>
+        <w:rPr>
+          <w:b w:val="0"/>
+          <w:bCs/>
+          <w:sz w:val="24"/>
+          <w:szCs w:val="24"/>
+        </w:rPr>
+        <w:t>. – М.: Высшая школа, 2002. – 400 с.</w:t>
       </w:r>
     </w:p>
     <w:p>
@@ -3106,7 +3218,27 @@
           <w:sz w:val="24"/>
           <w:szCs w:val="24"/>
         </w:rPr>
-        <w:t>Тимошенко С.П., Дж. Гудьер. Теория упругости. – М.: Наука, 1979. – 560 с.</w:t>
+        <w:t xml:space="preserve">Тимошенко С.П., Дж. </w:t>
+      </w:r>
+      <w:proofErr w:type="spellStart"/>
+      <w:r>
+        <w:rPr>
+          <w:b w:val="0"/>
+          <w:bCs/>
+          <w:sz w:val="24"/>
+          <w:szCs w:val="24"/>
+        </w:rPr>
+        <w:t>Гудьер</w:t>
+      </w:r>
+      <w:proofErr w:type="spellEnd"/>
+      <w:r>
+        <w:rPr>
+          <w:b w:val="0"/>
+          <w:bCs/>
+          <w:sz w:val="24"/>
+          <w:szCs w:val="24"/>
+        </w:rPr>
+        <w:t>. Теория упругости. – М.: Наука, 1979. – 560 с.</w:t>
       </w:r>
     </w:p>
     <w:p>
@@ -3126,6 +3258,7 @@
           <w:szCs w:val="24"/>
         </w:rPr>
       </w:pPr>
+      <w:proofErr w:type="spellStart"/>
       <w:r>
         <w:rPr>
           <w:b w:val="0"/>
@@ -3133,7 +3266,17 @@
           <w:sz w:val="24"/>
           <w:szCs w:val="24"/>
         </w:rPr>
-        <w:t xml:space="preserve">Галлагер Р. Метод конечных элементов. Основы: Пер. с англ. – М.: Мир, 1984. – 428 с. </w:t>
+        <w:t>Галлагер</w:t>
+      </w:r>
+      <w:proofErr w:type="spellEnd"/>
+      <w:r>
+        <w:rPr>
+          <w:b w:val="0"/>
+          <w:bCs/>
+          <w:sz w:val="24"/>
+          <w:szCs w:val="24"/>
+        </w:rPr>
+        <w:t xml:space="preserve"> Р. Метод конечных элементов. Основы: Пер. с англ. – М.: Мир, 1984. – 428 с. </w:t>
       </w:r>
     </w:p>
     <w:p>
@@ -3187,7 +3330,27 @@
           <w:sz w:val="24"/>
           <w:szCs w:val="24"/>
         </w:rPr>
-        <w:t>Каплун А.Б., Морозов Е.М., Олферьева М.А. ANSYS в руках инженера: Практическое руководство. – М.: Едиториал УРСС, 2003. – 272 с.</w:t>
+        <w:t xml:space="preserve">Каплун А.Б., Морозов Е.М., Олферьева М.А. ANSYS в руках инженера: Практическое руководство. – М.: </w:t>
+      </w:r>
+      <w:proofErr w:type="spellStart"/>
+      <w:r>
+        <w:rPr>
+          <w:b w:val="0"/>
+          <w:bCs/>
+          <w:sz w:val="24"/>
+          <w:szCs w:val="24"/>
+        </w:rPr>
+        <w:t>Едиториал</w:t>
+      </w:r>
+      <w:proofErr w:type="spellEnd"/>
+      <w:r>
+        <w:rPr>
+          <w:b w:val="0"/>
+          <w:bCs/>
+          <w:sz w:val="24"/>
+          <w:szCs w:val="24"/>
+        </w:rPr>
+        <w:t xml:space="preserve"> УРСС, 2003. – 272 с.</w:t>
       </w:r>
     </w:p>
     <w:p>
@@ -3228,7 +3391,7 @@
 </file>
 
 <file path=word/numbering.xml><?xml version="1.0" encoding="utf-8"?>
-<w:numbering xmlns:wpc="http://schemas.microsoft.com/office/word/2010/wordprocessingCanvas" xmlns:mc="http://schemas.openxmlformats.org/markup-compatibility/2006" xmlns:o="urn:schemas-microsoft-com:office:office" xmlns:r="http://schemas.openxmlformats.org/officeDocument/2006/relationships" xmlns:m="http://schemas.openxmlformats.org/officeDocument/2006/math" xmlns:v="urn:schemas-microsoft-com:vml" xmlns:wp14="http://schemas.microsoft.com/office/word/2010/wordprocessingDrawing" xmlns:wp="http://schemas.openxmlformats.org/drawingml/2006/wordprocessingDrawing" xmlns:w10="urn:schemas-microsoft-com:office:word" xmlns:w="http://schemas.openxmlformats.org/wordprocessingml/2006/main" xmlns:w14="http://schemas.microsoft.com/office/word/2010/wordml" xmlns:w15="http://schemas.microsoft.com/office/word/2012/wordml" xmlns:wpg="http://schemas.microsoft.com/office/word/2010/wordprocessingGroup" xmlns:wpi="http://schemas.microsoft.com/office/word/2010/wordprocessingInk" xmlns:wne="http://schemas.microsoft.com/office/word/2006/wordml" xmlns:wps="http://schemas.microsoft.com/office/word/2010/wordprocessingShape" mc:Ignorable="w14 w15 wp14">
+<w:numbering xmlns:wpc="http://schemas.microsoft.com/office/word/2010/wordprocessingCanvas" xmlns:cx="http://schemas.microsoft.com/office/drawing/2014/chartex" xmlns:cx1="http://schemas.microsoft.com/office/drawing/2015/9/8/chartex" xmlns:cx2="http://schemas.microsoft.com/office/drawing/2015/10/21/chartex" xmlns:cx3="http://schemas.microsoft.com/office/drawing/2016/5/9/chartex" xmlns:cx4="http://schemas.microsoft.com/office/drawing/2016/5/10/chartex" xmlns:cx5="http://schemas.microsoft.com/office/drawing/2016/5/11/chartex" xmlns:cx6="http://schemas.microsoft.com/office/drawing/2016/5/12/chartex" xmlns:cx7="http://schemas.microsoft.com/office/drawing/2016/5/13/chartex" xmlns:cx8="http://schemas.microsoft.com/office/drawing/2016/5/14/chartex" xmlns:mc="http://schemas.openxmlformats.org/markup-compatibility/2006" xmlns:aink="http://schemas.microsoft.com/office/drawing/2016/ink" xmlns:am3d="http://schemas.microsoft.com/office/drawing/2017/model3d" xmlns:o="urn:schemas-microsoft-com:office:office" xmlns:r="http://schemas.openxmlformats.org/officeDocument/2006/relationships" xmlns:m="http://schemas.openxmlformats.org/officeDocument/2006/math" xmlns:v="urn:schemas-microsoft-com:vml" xmlns:wp14="http://schemas.microsoft.com/office/word/2010/wordprocessingDrawing" xmlns:wp="http://schemas.openxmlformats.org/drawingml/2006/wordprocessingDrawing" xmlns:w10="urn:schemas-microsoft-com:office:word" xmlns:w="http://schemas.openxmlformats.org/wordprocessingml/2006/main" xmlns:w14="http://schemas.microsoft.com/office/word/2010/wordml" xmlns:w15="http://schemas.microsoft.com/office/word/2012/wordml" xmlns:w16cex="http://schemas.microsoft.com/office/word/2018/wordml/cex" xmlns:w16cid="http://schemas.microsoft.com/office/word/2016/wordml/cid" xmlns:w16="http://schemas.microsoft.com/office/word/2018/wordml" xmlns:w16sdtdh="http://schemas.microsoft.com/office/word/2020/wordml/sdtdatahash" xmlns:w16se="http://schemas.microsoft.com/office/word/2015/wordml/symex" xmlns:wpg="http://schemas.microsoft.com/office/word/2010/wordprocessingGroup" xmlns:wpi="http://schemas.microsoft.com/office/word/2010/wordprocessingInk" xmlns:wne="http://schemas.microsoft.com/office/word/2006/wordml" xmlns:wps="http://schemas.microsoft.com/office/word/2010/wordprocessingShape" mc:Ignorable="w14 w15 w16se w16cid w16 w16cex w16sdtdh wp14">
   <w:abstractNum w:abstractNumId="0" w15:restartNumberingAfterBreak="0">
     <w:nsid w:val="2BF16A5D"/>
     <w:multiLevelType w:val="hybridMultilevel"/>
@@ -3836,7 +3999,7 @@
 </file>
 
 <file path=word/styles.xml><?xml version="1.0" encoding="utf-8"?>
-<w:styles xmlns:mc="http://schemas.openxmlformats.org/markup-compatibility/2006" xmlns:r="http://schemas.openxmlformats.org/officeDocument/2006/relationships" xmlns:w="http://schemas.openxmlformats.org/wordprocessingml/2006/main" xmlns:w14="http://schemas.microsoft.com/office/word/2010/wordml" xmlns:w15="http://schemas.microsoft.com/office/word/2012/wordml" mc:Ignorable="w14 w15">
+<w:styles xmlns:mc="http://schemas.openxmlformats.org/markup-compatibility/2006" xmlns:r="http://schemas.openxmlformats.org/officeDocument/2006/relationships" xmlns:w="http://schemas.openxmlformats.org/wordprocessingml/2006/main" xmlns:w14="http://schemas.microsoft.com/office/word/2010/wordml" xmlns:w15="http://schemas.microsoft.com/office/word/2012/wordml" xmlns:w16cex="http://schemas.microsoft.com/office/word/2018/wordml/cex" xmlns:w16cid="http://schemas.microsoft.com/office/word/2016/wordml/cid" xmlns:w16="http://schemas.microsoft.com/office/word/2018/wordml" xmlns:w16sdtdh="http://schemas.microsoft.com/office/word/2020/wordml/sdtdatahash" xmlns:w16se="http://schemas.microsoft.com/office/word/2015/wordml/symex" mc:Ignorable="w14 w15 w16se w16cid w16 w16cex w16sdtdh">
   <w:docDefaults>
     <w:rPrDefault>
       <w:rPr>
@@ -3852,7 +4015,7 @@
       </w:pPr>
     </w:pPrDefault>
   </w:docDefaults>
-  <w:latentStyles w:defLockedState="0" w:defUIPriority="99" w:defSemiHidden="0" w:defUnhideWhenUsed="0" w:defQFormat="0" w:count="371">
+  <w:latentStyles w:defLockedState="0" w:defUIPriority="99" w:defSemiHidden="0" w:defUnhideWhenUsed="0" w:defQFormat="0" w:count="376">
     <w:lsdException w:name="Normal" w:uiPriority="0" w:qFormat="1"/>
     <w:lsdException w:name="heading 1" w:uiPriority="9" w:qFormat="1"/>
     <w:lsdException w:name="heading 2" w:semiHidden="1" w:uiPriority="9" w:unhideWhenUsed="1" w:qFormat="1"/>
@@ -4224,6 +4387,11 @@
     <w:lsdException w:name="List Table 5 Dark Accent 6" w:uiPriority="50"/>
     <w:lsdException w:name="List Table 6 Colorful Accent 6" w:uiPriority="51"/>
     <w:lsdException w:name="List Table 7 Colorful Accent 6" w:uiPriority="52"/>
+    <w:lsdException w:name="Mention" w:semiHidden="1" w:unhideWhenUsed="1"/>
+    <w:lsdException w:name="Smart Hyperlink" w:semiHidden="1" w:unhideWhenUsed="1"/>
+    <w:lsdException w:name="Hashtag" w:semiHidden="1" w:unhideWhenUsed="1"/>
+    <w:lsdException w:name="Unresolved Mention" w:semiHidden="1" w:unhideWhenUsed="1"/>
+    <w:lsdException w:name="Smart Link" w:semiHidden="1" w:unhideWhenUsed="1"/>
   </w:latentStyles>
   <w:style w:type="paragraph" w:default="1" w:styleId="a">
     <w:name w:val="Normal"/>

</xml_diff>